<commit_message>
Fix the word template
</commit_message>
<xml_diff>
--- a/events/document_templates/contact_legal_block.docx
+++ b/events/document_templates/contact_legal_block.docx
@@ -2,94 +2,158 @@
 <file path=word/document.xml><?xml version="1.0" encoding="utf-8"?>
 <w:document xmlns:wpc="http://schemas.microsoft.com/office/word/2010/wordprocessingCanvas" xmlns:cx="http://schemas.microsoft.com/office/drawing/2014/chartex" xmlns:cx1="http://schemas.microsoft.com/office/drawing/2015/9/8/chartex" xmlns:cx2="http://schemas.microsoft.com/office/drawing/2015/10/21/chartex" xmlns:cx3="http://schemas.microsoft.com/office/drawing/2016/5/9/chartex" xmlns:cx4="http://schemas.microsoft.com/office/drawing/2016/5/10/chartex" xmlns:cx5="http://schemas.microsoft.com/office/drawing/2016/5/11/chartex" xmlns:cx6="http://schemas.microsoft.com/office/drawing/2016/5/12/chartex" xmlns:cx7="http://schemas.microsoft.com/office/drawing/2016/5/13/chartex" xmlns:cx8="http://schemas.microsoft.com/office/drawing/2016/5/14/chartex" xmlns:mc="http://schemas.openxmlformats.org/markup-compatibility/2006" xmlns:aink="http://schemas.microsoft.com/office/drawing/2016/ink" xmlns:am3d="http://schemas.microsoft.com/office/drawing/2017/model3d" xmlns:o="urn:schemas-microsoft-com:office:office" xmlns:oel="http://schemas.microsoft.com/office/2019/extlst" xmlns:r="http://schemas.openxmlformats.org/officeDocument/2006/relationships" xmlns:m="http://schemas.openxmlformats.org/officeDocument/2006/math" xmlns:v="urn:schemas-microsoft-com:vml" xmlns:wp14="http://schemas.microsoft.com/office/word/2010/wordprocessingDrawing" xmlns:wp="http://schemas.openxmlformats.org/drawingml/2006/wordprocessingDrawing" xmlns:w10="urn:schemas-microsoft-com:office:word" xmlns:w="http://schemas.openxmlformats.org/wordprocessingml/2006/main" xmlns:w14="http://schemas.microsoft.com/office/word/2010/wordml" xmlns:w15="http://schemas.microsoft.com/office/word/2012/wordml" xmlns:w16cex="http://schemas.microsoft.com/office/word/2018/wordml/cex" xmlns:w16cid="http://schemas.microsoft.com/office/word/2016/wordml/cid" xmlns:w16="http://schemas.microsoft.com/office/word/2018/wordml" xmlns:w16du="http://schemas.microsoft.com/office/word/2023/wordml/word16du" xmlns:w16sdtdh="http://schemas.microsoft.com/office/word/2020/wordml/sdtdatahash" xmlns:w16sdtfl="http://schemas.microsoft.com/office/word/2024/wordml/sdtformatlock" xmlns:w16se="http://schemas.microsoft.com/office/word/2015/wordml/symex" xmlns:wpg="http://schemas.microsoft.com/office/word/2010/wordprocessingGroup" xmlns:wpi="http://schemas.microsoft.com/office/word/2010/wordprocessingInk" xmlns:wne="http://schemas.microsoft.com/office/word/2006/wordml" xmlns:wps="http://schemas.microsoft.com/office/word/2010/wordprocessingShape" mc:Ignorable="w14 w15 w16se w16cid w16 w16cex w16sdtdh w16sdtfl w16du wp14">
   <w:body>
+    <w:tbl>
+      <w:tblPr>
+        <w:tblStyle w:val="Tabellenraster"/>
+        <w:tblW w:w="0" w:type="auto"/>
+        <w:tblBorders>
+          <w:top w:val="none" w:sz="0" w:space="0" w:color="auto"/>
+          <w:left w:val="none" w:sz="0" w:space="0" w:color="auto"/>
+          <w:bottom w:val="none" w:sz="0" w:space="0" w:color="auto"/>
+          <w:right w:val="none" w:sz="0" w:space="0" w:color="auto"/>
+          <w:insideH w:val="none" w:sz="0" w:space="0" w:color="auto"/>
+          <w:insideV w:val="none" w:sz="0" w:space="0" w:color="auto"/>
+        </w:tblBorders>
+        <w:tblLook w:val="04A0" w:firstRow="1" w:lastRow="0" w:firstColumn="1" w:lastColumn="0" w:noHBand="0" w:noVBand="1"/>
+      </w:tblPr>
+      <w:tblGrid>
+        <w:gridCol w:w="4820"/>
+        <w:gridCol w:w="4242"/>
+      </w:tblGrid>
+      <w:tr>
+        <w:tc>
+          <w:tcPr>
+            <w:tcW w:w="4820" w:type="dxa"/>
+          </w:tcPr>
+          <w:p>
+            <w:proofErr w:type="gramStart"/>
+            <w:r>
+              <w:t>{{ company.name</w:t>
+            </w:r>
+            <w:proofErr w:type="gramEnd"/>
+            <w:r>
+              <w:t xml:space="preserve"> }}</w:t>
+            </w:r>
+          </w:p>
+        </w:tc>
+        <w:tc>
+          <w:tcPr>
+            <w:tcW w:w="4242" w:type="dxa"/>
+          </w:tcPr>
+          <w:p>
+            <w:proofErr w:type="gramStart"/>
+            <w:r>
+              <w:t>Email</w:t>
+            </w:r>
+            <w:proofErr w:type="gramEnd"/>
+            <w:r>
+              <w:t xml:space="preserve">: </w:t>
+            </w:r>
+            <w:proofErr w:type="gramStart"/>
+            <w:r>
+              <w:t xml:space="preserve">{{ </w:t>
+            </w:r>
+            <w:proofErr w:type="spellStart"/>
+            <w:r>
+              <w:t>company</w:t>
+            </w:r>
+            <w:proofErr w:type="gramEnd"/>
+            <w:r>
+              <w:t>.</w:t>
+            </w:r>
+            <w:proofErr w:type="gramStart"/>
+            <w:r>
+              <w:t>email</w:t>
+            </w:r>
+            <w:proofErr w:type="spellEnd"/>
+            <w:proofErr w:type="gramEnd"/>
+            <w:r>
+              <w:t xml:space="preserve"> }}</w:t>
+            </w:r>
+          </w:p>
+        </w:tc>
+      </w:tr>
+      <w:tr>
+        <w:tc>
+          <w:tcPr>
+            <w:tcW w:w="4820" w:type="dxa"/>
+          </w:tcPr>
+          <w:p>
+            <w:proofErr w:type="gramStart"/>
+            <w:r>
+              <w:t xml:space="preserve">{{ </w:t>
+            </w:r>
+            <w:proofErr w:type="spellStart"/>
+            <w:r>
+              <w:t>company</w:t>
+            </w:r>
+            <w:proofErr w:type="gramEnd"/>
+            <w:r>
+              <w:t>.address</w:t>
+            </w:r>
+            <w:proofErr w:type="spellEnd"/>
+            <w:r>
+              <w:t xml:space="preserve"> }}</w:t>
+            </w:r>
+          </w:p>
+        </w:tc>
+        <w:tc>
+          <w:tcPr>
+            <w:tcW w:w="4242" w:type="dxa"/>
+          </w:tcPr>
+          <w:p>
+            <w:r>
+              <w:t xml:space="preserve">Phone: </w:t>
+            </w:r>
+            <w:proofErr w:type="gramStart"/>
+            <w:r>
+              <w:t xml:space="preserve">{{ </w:t>
+            </w:r>
+            <w:proofErr w:type="spellStart"/>
+            <w:r>
+              <w:t>company</w:t>
+            </w:r>
+            <w:proofErr w:type="gramEnd"/>
+            <w:r>
+              <w:t>.phone</w:t>
+            </w:r>
+            <w:proofErr w:type="spellEnd"/>
+            <w:r>
+              <w:t xml:space="preserve"> }}</w:t>
+            </w:r>
+          </w:p>
+        </w:tc>
+      </w:tr>
+      <w:tr>
+        <w:tc>
+          <w:tcPr>
+            <w:tcW w:w="9062" w:type="dxa"/>
+            <w:gridSpan w:val="2"/>
+          </w:tcPr>
+          <w:p>
+            <w:proofErr w:type="gramStart"/>
+            <w:r>
+              <w:t xml:space="preserve">{{ </w:t>
+            </w:r>
+            <w:proofErr w:type="spellStart"/>
+            <w:r>
+              <w:t>company</w:t>
+            </w:r>
+            <w:proofErr w:type="gramEnd"/>
+            <w:r>
+              <w:t>.legal_notice</w:t>
+            </w:r>
+            <w:proofErr w:type="spellEnd"/>
+            <w:r>
+              <w:t xml:space="preserve"> }}</w:t>
+            </w:r>
+          </w:p>
+        </w:tc>
+      </w:tr>
+    </w:tbl>
     <w:p>
-      <w:pPr>
-        <w:spacing w:line="240" w:lineRule="auto"/>
-      </w:pPr>
-      <w:proofErr w:type="spellStart"/>
-      <w:r>
-        <w:t>Example</w:t>
-      </w:r>
-      <w:proofErr w:type="spellEnd"/>
-      <w:r>
-        <w:t xml:space="preserve"> Company Ltd.</w:t>
-      </w:r>
-      <w:r>
-        <w:br/>
-      </w:r>
-      <w:proofErr w:type="spellStart"/>
-      <w:r>
-        <w:t>Example</w:t>
-      </w:r>
-      <w:proofErr w:type="spellEnd"/>
-      <w:r>
-        <w:t xml:space="preserve"> Street 1</w:t>
-      </w:r>
-      <w:r>
-        <w:br/>
-      </w:r>
-      <w:r>
-        <w:t>01067 Dresden</w:t>
-      </w:r>
-      <w:r>
-        <w:br/>
-      </w:r>
-      <w:r>
-        <w:t>Germany</w:t>
-      </w:r>
-    </w:p>
-    <w:p>
-      <w:pPr>
-        <w:spacing w:line="240" w:lineRule="auto"/>
-      </w:pPr>
-      <w:r>
-        <w:t xml:space="preserve">Email: </w:t>
-      </w:r>
-      <w:hyperlink r:id="rId4" w:history="1">
-        <w:r>
-          <w:rPr>
-            <w:rStyle w:val="Hyperlink"/>
-          </w:rPr>
-          <w:t>contact@example.invalid</w:t>
-        </w:r>
-      </w:hyperlink>
-      <w:r>
-        <w:br/>
-      </w:r>
-      <w:r>
-        <w:t>Phone: +49 351 000000</w:t>
-      </w:r>
-    </w:p>
-    <w:p>
-      <w:pPr>
-        <w:spacing w:line="240" w:lineRule="auto"/>
-      </w:pPr>
-      <w:r>
-        <w:t xml:space="preserve">This </w:t>
-      </w:r>
-      <w:proofErr w:type="spellStart"/>
-      <w:r>
-        <w:t>document</w:t>
-      </w:r>
-      <w:proofErr w:type="spellEnd"/>
-      <w:r>
-        <w:t xml:space="preserve"> was </w:t>
-      </w:r>
-      <w:proofErr w:type="spellStart"/>
-      <w:r>
-        <w:t>generated</w:t>
-      </w:r>
-      <w:proofErr w:type="spellEnd"/>
       <w:r>
         <w:t xml:space="preserve"> </w:t>
-      </w:r>
-      <w:proofErr w:type="spellStart"/>
-      <w:r>
-        <w:t>automatically</w:t>
-      </w:r>
-      <w:proofErr w:type="spellEnd"/>
-      <w:r>
-        <w:t>.</w:t>
       </w:r>
     </w:p>
     <w:sectPr>
@@ -1042,6 +1106,25 @@
       <w:shd w:val="clear" w:color="auto" w:fill="E1DFDD"/>
     </w:rPr>
   </w:style>
+  <w:style w:type="table" w:styleId="Tabellenraster">
+    <w:name w:val="Table Grid"/>
+    <w:basedOn w:val="NormaleTabelle"/>
+    <w:uiPriority w:val="39"/>
+    <w:rsid w:val="00A441B7"/>
+    <w:pPr>
+      <w:spacing w:after="0" w:line="240" w:lineRule="auto"/>
+    </w:pPr>
+    <w:tblPr>
+      <w:tblBorders>
+        <w:top w:val="single" w:sz="4" w:space="0" w:color="auto"/>
+        <w:left w:val="single" w:sz="4" w:space="0" w:color="auto"/>
+        <w:bottom w:val="single" w:sz="4" w:space="0" w:color="auto"/>
+        <w:right w:val="single" w:sz="4" w:space="0" w:color="auto"/>
+        <w:insideH w:val="single" w:sz="4" w:space="0" w:color="auto"/>
+        <w:insideV w:val="single" w:sz="4" w:space="0" w:color="auto"/>
+      </w:tblBorders>
+    </w:tblPr>
+  </w:style>
 </w:styles>
 </file>
 

</xml_diff>